<commit_message>
Build ListOK math and physics prototype and illustrated PDF submission
</commit_message>
<xml_diff>
--- a/questionnaire-public.docx
+++ b/questionnaire-public.docx
@@ -1065,15 +1065,8 @@
               <w:keepLines w:val="0"/>
               <w:spacing w:before="0" w:after="0" w:line="240" w:lineRule="exact"/>
             </w:pPr>
-            <w:r/>
             <w:r>
-              <w:rPr>
-                <w:rFonts w:ascii="Arial" w:hAnsi="Arial" w:eastAsia="Arial" w:cs="Arial"/>
-                <w:b w:val="0"/>
-                <w:color w:val="000000"/>
-                <w:sz w:val="20"/>
-              </w:rPr>
-              <w:t>Сервис, который помогает учителю превращать свои материалы в рабочие листы с заданиями и местом для решения, проверять их и выпускать PDF для печати или отправки классу.</w:t>
+              <w:t>ЛистОК помогает учителю математики или физики превратить фото собственных заданий в редактируемый LaTeX и рабочий лист с формулами, местом для решения и отдельными ответами в PDF.</w:t>
             </w:r>
           </w:p>
         </w:tc>
@@ -1130,15 +1123,8 @@
               <w:keepLines w:val="0"/>
               <w:spacing w:before="0" w:after="0" w:line="240" w:lineRule="exact"/>
             </w:pPr>
-            <w:r/>
             <w:r>
-              <w:rPr>
-                <w:rFonts w:ascii="Arial" w:hAnsi="Arial" w:eastAsia="Arial" w:cs="Arial"/>
-                <w:b w:val="0"/>
-                <w:color w:val="000000"/>
-                <w:sz w:val="20"/>
-              </w:rPr>
-              <w:t>Учитель вручную переносит задания из разных материалов, набирает формулы, подбирает похожие задачи и верстает место для ответа. При изменении уровня сложности эту работу приходится повторять. Мы хотим сократить время такой подготовки, сохранив за педагогом выбор заданий и проверку содержания. Масштаб проблемы и реальную экономию времени предстоит измерить на пилоте.</w:t>
+              <w:t>В Word учитель вручную переносит условия и набирает дроби, корни, индексы, производные и физические единицы, затем выравнивает их и оставляет место для решения. Для другого варианта задания приходится заново переписывать и оформлять. ЛистОК помогает сократить этот этап: готовит редактируемый черновик, а LaTeX берёт на себя вёрстку формул и страницы. Учитель сохраняет выбор материала и проверку содержания. Реальную экономию времени предстоит измерить на пилоте.</w:t>
             </w:r>
           </w:p>
         </w:tc>
@@ -1195,15 +1181,8 @@
               <w:keepLines w:val="0"/>
               <w:spacing w:before="0" w:after="0" w:line="240" w:lineRule="exact"/>
             </w:pPr>
-            <w:r/>
             <w:r>
-              <w:rPr>
-                <w:rFonts w:ascii="Arial" w:hAnsi="Arial" w:eastAsia="Arial" w:cs="Arial"/>
-                <w:b w:val="0"/>
-                <w:color w:val="000000"/>
-                <w:sz w:val="20"/>
-              </w:rPr>
-              <w:t>Целевой сценарий: учитель открывает мини-приложение из бота MAX, передаёт фото, PDF или текст и выбирает оформление. ИИ готовит черновик заданий; учитель проверяет формулы, условия, ответы и вносит правки. Сервис формирует PDF рабочего листа и отдельный лист ответов. Можно подготовить похожий вариант другой сложности.</w:t>
+              <w:t>В локальном прототипе учитель выбирает математику или физику, загружает фото PNG/JPEG и получает черновик от GigaChat. Проверяет числа, формулы, условия и ответы в редакторе LaTeX, вносит правки и собирает рабочий лист A4 и отдельные ответы. Можно получить похожий вариант другой сложности и также проверить его перед сборкой. Для знакомства есть примеры, подготовленные вручную, без ИИ.</w:t>
             </w:r>
           </w:p>
           <w:p>
@@ -1213,13 +1192,7 @@
               <w:spacing w:before="0" w:after="0" w:line="240" w:lineRule="exact"/>
             </w:pPr>
             <w:r>
-              <w:rPr>
-                <w:rFonts w:ascii="Arial" w:hAnsi="Arial" w:eastAsia="Arial" w:cs="Arial"/>
-                <w:b w:val="0"/>
-                <w:color w:val="000000"/>
-                <w:sz w:val="20"/>
-              </w:rPr>
-              <w:t>В существующем прототипе есть код обработки изображений, редактирования LaTeX и формирования PDF. Адаптация к MAX, надёжная обработка PDF и централизованный доступ к ИИ входят в план развития.</w:t>
+              <w:t>Для конкурсной версии планируем вход через мини-приложение MAX для пользователей Сферума. PDF на входе и обработка сканов отдельным конвейером пока входят в план.</w:t>
             </w:r>
           </w:p>
         </w:tc>
@@ -1276,15 +1249,8 @@
               <w:keepLines w:val="0"/>
               <w:spacing w:before="0" w:after="0" w:line="240" w:lineRule="exact"/>
             </w:pPr>
-            <w:r/>
             <w:r>
-              <w:rPr>
-                <w:rFonts w:ascii="Arial" w:hAnsi="Arial" w:eastAsia="Arial" w:cs="Arial"/>
-                <w:b w:val="0"/>
-                <w:color w:val="000000"/>
-                <w:sz w:val="20"/>
-              </w:rPr>
-              <w:t>Основные пользователи — школьные учителя, которым нужны задания по собственным материалам и аккуратные листы для урока. Им важны корректные формулы, редактирование результата и предсказуемое оформление без ручной вёрстки. Школьники получают подобранные учителем задания с понятной структурой и местом для решения. Первый пилот планируем в ГБОУ «Школа 2200»; дальнейшие предметы и возрастные группы выберем по обратной связи.</w:t>
+              <w:t>Основные пользователи — учителя математики и физики, которым нужны задания по своим материалам и аккуратные печатные листы. Их задача — быстро подготовить формулы, единицы измерения и несколько вариантов, сохранив возможность редактирования. Ученики получают понятные условия и место для письменного решения. Первый пилот планируем в ГБОУ «Школа 2200»; дальнейшее расширение выберем по обратной связи учителей.</w:t>
             </w:r>
           </w:p>
         </w:tc>
@@ -1372,15 +1338,8 @@
               <w:keepLines w:val="0"/>
               <w:spacing w:before="0" w:after="0" w:line="240" w:lineRule="exact"/>
             </w:pPr>
-            <w:r/>
             <w:r>
-              <w:rPr>
-                <w:rFonts w:ascii="Arial" w:hAnsi="Arial" w:eastAsia="Arial" w:cs="Arial"/>
-                <w:b w:val="0"/>
-                <w:color w:val="000000"/>
-                <w:sz w:val="20"/>
-              </w:rPr>
-              <w:t>Исследование пользователей по этому проекту пока не проведено; подтверждённой экономии времени и статистики спроса нет.</w:t>
+              <w:t>Исследование пользовательского спроса пока не проведено; подтверждённой экономии времени и статистики использования нет. Работающий локальный пример показывает сценарий, но не заменяет исследование.</w:t>
             </w:r>
           </w:p>
           <w:p>
@@ -1390,13 +1349,7 @@
               <w:spacing w:before="0" w:after="0" w:line="240" w:lineRule="exact"/>
             </w:pPr>
             <w:r>
-              <w:rPr>
-                <w:rFonts w:ascii="Arial" w:hAnsi="Arial" w:eastAsia="Arial" w:cs="Arial"/>
-                <w:b w:val="0"/>
-                <w:color w:val="000000"/>
-                <w:sz w:val="20"/>
-              </w:rPr>
-              <w:t>План пилота: 5 учителей, 20 рабочих листов, до 100 учеников. Это расчётный сценарий, а не фактический охват. Сравним время ручной подготовки и работы с сервисом на одинаковых материалах, включая проверку и исправления. Отдельно посчитаем ошибки распознавания формул, долю заданий, требующих правки, и повторное использование сервиса учителями.</w:t>
+              <w:t>План пилота: 5 учителей, 20 рабочих листов, до 100 учеников. Это план, а не фактический охват. На одинаковых заданиях сравним ручной набор в Word и работу через сервис, включая проверку и исправления. Зафиксируем ошибки формул и ответов, удачные сборки PDF и желание учителей пользоваться сервисом повторно.</w:t>
             </w:r>
           </w:p>
         </w:tc>
@@ -1453,15 +1406,8 @@
               <w:keepLines w:val="0"/>
               <w:spacing w:before="0" w:after="0" w:line="240" w:lineRule="exact"/>
             </w:pPr>
-            <w:r/>
             <w:r>
-              <w:rPr>
-                <w:rFonts w:ascii="Arial" w:hAnsi="Arial" w:eastAsia="Arial" w:cs="Arial"/>
-                <w:b w:val="0"/>
-                <w:color w:val="000000"/>
-                <w:sz w:val="20"/>
-              </w:rPr>
-              <w:t>В обычном текстовом редакторе учитель сам переносит задания и верстает страницу; ответ чат-бота также приходится проверять и оформлять. Наш сценарий связывает материал учителя, редактируемый черновик, место для решения, лист ответов и похожий вариант в одном процессе. LaTeX обеспечивает оформление формул. Для конкурсной версии планируем вход через MAX и работу без личного API-ключа учителя. Уникальность на рынке пока не подтверждена сравнительным исследованием.</w:t>
+              <w:t>Сценарий объединяет материал учителя, редактируемый LaTeX, место для письменного решения, отдельные ответы и похожий вариант. Для математики и физики это помогает работать с дробями, индексами, корнями и единицами без повторного ручного оформления формул в Word. Учитель видит и исправляет оба варианта до печати. Вход через MAX — следующий этап. Уникальность на рынке пока не подтверждена сравнительным исследованием.</w:t>
             </w:r>
           </w:p>
         </w:tc>
@@ -1518,15 +1464,8 @@
               <w:keepLines w:val="0"/>
               <w:spacing w:before="0" w:after="0" w:line="240" w:lineRule="exact"/>
             </w:pPr>
-            <w:r/>
             <w:r>
-              <w:rPr>
-                <w:rFonts w:ascii="Arial" w:hAnsi="Arial" w:eastAsia="Arial" w:cs="Arial"/>
-                <w:b w:val="0"/>
-                <w:color w:val="000000"/>
-                <w:sz w:val="20"/>
-              </w:rPr>
-              <w:t>Ожидаемая польза — меньше времени на перенос и оформление заданий и больше возможностей подобрать практику под занятие. Учитель сохраняет контроль над учебным содержанием, сложностью и ответами. Рабочий лист поддерживает самостоятельное письменное решение ученика. Снижение нагрузки и влияние на учебный результат пока не доказаны: в пилоте проверим удобство, качество готовых материалов и время подготовки.</w:t>
+              <w:t>Ожидаемая польза — меньше времени на перенос и оформление формул и больше возможностей подготовить практику под конкретный урок. Учитель контролирует условия, сложность и ответы, ученик решает задания письменно. Ошибки ИИ не скрываются: в реальном тесте один ответ на дробное выражение потребовал исправления. Экономию времени и влияние на обучение пока не заявляем как доказанный результат; проверим их в пилоте.</w:t>
             </w:r>
           </w:p>
         </w:tc>
@@ -1583,15 +1522,8 @@
               <w:keepLines w:val="0"/>
               <w:spacing w:before="0" w:after="0" w:line="240" w:lineRule="exact"/>
             </w:pPr>
-            <w:r/>
             <w:r>
-              <w:rPr>
-                <w:rFonts w:ascii="Arial" w:hAnsi="Arial" w:eastAsia="Arial" w:cs="Arial"/>
-                <w:b w:val="0"/>
-                <w:color w:val="000000"/>
-                <w:sz w:val="20"/>
-              </w:rPr>
-              <w:t>После пилота планируем расширять предметные шаблоны, добавить сохранение и повторное использование листов, улучшать распознавание формул и обработку сканов. Следующий шаг — подключать новые классы и школы с учётом обратной связи. Для роста нагрузки потребуются очередь генерации, лимиты запросов и серверный доступ к ИИ. Бесплатность для всех и партнёрское финансирование не подтверждены; модель оплаты и квоты ещё предстоит определить.</w:t>
+              <w:t>После пилота планируем улучшать распознавание формул, добавить PDF и сканы, сохранение шаблонов и адаптер MAX, затем подключать новые классы и школы. Для роста нужны авторизация, раздельные данные, очередь генерации и квоты ИИ. Целевой сценарий — учитель без личного API-ключа, доступ обслуживает сервер проекта. Партнёрство, бесплатные квоты и финансирование не подтверждены; их предстоит определить.</w:t>
             </w:r>
           </w:p>
         </w:tc>
@@ -1648,15 +1580,8 @@
               <w:keepLines w:val="0"/>
               <w:spacing w:before="0" w:after="0" w:line="240" w:lineRule="exact"/>
             </w:pPr>
-            <w:r/>
             <w:r>
-              <w:rPr>
-                <w:rFonts w:ascii="Arial" w:hAnsi="Arial" w:eastAsia="Arial" w:cs="Arial"/>
-                <w:b w:val="0"/>
-                <w:color w:val="000000"/>
-                <w:sz w:val="20"/>
-              </w:rPr>
-              <w:t>Основа — веб-прототип Worksheet Creator на Python/Flask, HTML/CSS/JavaScript, SQLite, GigaChat API и pdfLaTeX. Авторы исходного проекта — Драндров Максим Дмитриевич и Головков Владимир Сергеевич, руководитель — Неумоин Павел Дмитриевич. Наша команда разрабатывает конкурсную адаптацию.</w:t>
+              <w:t>Конкурсная версия «ЛистОК», команда «Код урока». Стек: Python/Flask, HTML/CSS/JavaScript, SQLite, GigaChat API, LaTeX и TikZ.</w:t>
             </w:r>
           </w:p>
           <w:p>
@@ -1666,13 +1591,7 @@
               <w:spacing w:before="0" w:after="0" w:line="240" w:lineRule="exact"/>
             </w:pPr>
             <w:r>
-              <w:rPr>
-                <w:rFonts w:ascii="Arial" w:hAnsi="Arial" w:eastAsia="Arial" w:cs="Arial"/>
-                <w:b w:val="0"/>
-                <w:color w:val="000000"/>
-                <w:sz w:val="20"/>
-              </w:rPr>
-              <w:t>В коде есть загрузка фото, редактор первого варианта LaTeX, макет A4, отдельные ответы, похожий вариант и история. Локально проверены интерфейс и маршруты; полный цикл с ИИ и новой сборкой PDF ещё не проверен.</w:t>
+              <w:t>Готов локальный прототип для математики и физики: фото PNG/JPEG, редактор двух вариантов, ручные примеры и сборка A4 через XeLaTeX с отдельными ответами. Проверены реальные обращения к GigaChat-3-Ultra и локальная PDF-сборка; качество проверяет учитель. Это не готовый публичный сервис.</w:t>
             </w:r>
           </w:p>
           <w:p>
@@ -1682,13 +1601,7 @@
               <w:spacing w:before="0" w:after="0" w:line="240" w:lineRule="exact"/>
             </w:pPr>
             <w:r>
-              <w:rPr>
-                <w:rFonts w:ascii="Arial" w:hAnsi="Arial" w:eastAsia="Arial" w:cs="Arial"/>
-                <w:b w:val="0"/>
-                <w:color w:val="000000"/>
-                <w:sz w:val="20"/>
-              </w:rPr>
-              <w:t>Для MAX планируем HTTPS-хостинг, бот, MAX Bridge, проверку данных запуска и выдачу PDF. До пилота нужны безопасная компиляция, раздельный доступ к истории и проверка каждого варианта учителем. Для фото и сканов рассматриваем GigaChat API либо Yandex Vision OCR и YandexGPT. Marp возможен позднее для дополнительных шаблонов; сейчас его нет.</w:t>
+              <w:t>Для MAX нужны HTTPS-хостинг, бот, MAX Bridge, проверка данных запуска и выдача PDF. До пилота — изоляция компилятора, авторизация и раздельная история. PDF-вход и альтернативный путь Yandex Vision OCR → YandexGPT пока в плане. Marp не реализован.</w:t>
             </w:r>
           </w:p>
           <w:p>
@@ -1698,13 +1611,7 @@
               <w:spacing w:before="0" w:after="0" w:line="240" w:lineRule="exact"/>
             </w:pPr>
             <w:r>
-              <w:rPr>
-                <w:rFonts w:ascii="Arial" w:hAnsi="Arial" w:eastAsia="Arial" w:cs="Arial"/>
-                <w:b w:val="0"/>
-                <w:color w:val="000000"/>
-                <w:sz w:val="20"/>
-              </w:rPr>
-              <w:t>Потребуются сервер, хранилище файлов, TeX и квота ИИ. Целевой доступ — через сервер проекта без личного ключа учителя. Финансирование и партнёрская поддержка не подтверждены.</w:t>
+              <w:t>Ресурсы: сервер, хранилище, TeX, доступ и квота ИИ. Личный ключ учителя в целевом сценарии не нужен; партнёрство и источник оплаты не подтверждены.</w:t>
             </w:r>
           </w:p>
           <w:p>
@@ -1714,13 +1621,7 @@
               <w:spacing w:before="0" w:after="0" w:line="240" w:lineRule="exact"/>
             </w:pPr>
             <w:r>
-              <w:rPr>
-                <w:rFonts w:ascii="Arial" w:hAnsi="Arial" w:eastAsia="Arial" w:cs="Arial"/>
-                <w:b w:val="0"/>
-                <w:color w:val="000000"/>
-                <w:sz w:val="20"/>
-              </w:rPr>
-              <w:t>Предварительный план — 4 недели, 160 человеко-часов: по 40 на воспроизводимый запуск, качество PDF и LaTeX, интеграцию MAX и пилот. Это оценка, которую уточним после проверки прототипа.</w:t>
+              <w:t>Оценка следующего этапа — 4 недели, 160 человеко-часов: по 40 на устойчивость запуска, качество формул и PDF, адаптацию MAX и пилот. Сроки уточним по результатам тестов.</w:t>
             </w:r>
           </w:p>
           <w:p>

</xml_diff>